<commit_message>
Finalize AE of Miami invoice: INV-003 for August 2026
Invoice date set to today, due date set to July 31 (the day before
the invoiced service month begins), per the single-payment-before-
start-of-month term in the agreement.

Co-Authored-By: Claude Sonnet 5 <noreply@anthropic.com>
Claude-Session: https://claude.ai/code/session_01BxAcWmDLYty8SPokGAm85x
</commit_message>
<xml_diff>
--- a/entregables/clientes/NostraInvoice_AEofMiami.docx
+++ b/entregables/clientes/NostraInvoice_AEofMiami.docx
@@ -113,7 +113,7 @@
                 <w:sz w:val="19"/>
                 <w:szCs w:val="19"/>
               </w:rPr>
-              <w:t xml:space="preserve">[INV-000]</w:t>
+              <w:t xml:space="preserve">INV-003</w:t>
             </w:r>
             <w:r>
               <w:rPr>
@@ -144,7 +144,7 @@
                 <w:sz w:val="19"/>
                 <w:szCs w:val="19"/>
               </w:rPr>
-              <w:t xml:space="preserve">[DATE]</w:t>
+              <w:t xml:space="preserve">July 22, 2026</w:t>
             </w:r>
             <w:r>
               <w:rPr>
@@ -175,7 +175,7 @@
                 <w:sz w:val="19"/>
                 <w:szCs w:val="19"/>
               </w:rPr>
-              <w:t xml:space="preserve">[DUE DATE]</w:t>
+              <w:t xml:space="preserve">July 31, 2026</w:t>
             </w:r>
           </w:p>
         </w:tc>
@@ -532,7 +532,7 @@
                 <w:sz w:val="21"/>
                 <w:szCs w:val="21"/>
               </w:rPr>
-              <w:t xml:space="preserve">[MONTH]</w:t>
+              <w:t xml:space="preserve">August 2026</w:t>
             </w:r>
           </w:p>
         </w:tc>

</xml_diff>